<commit_message>
Add company logos and homepage previews, and put the portfolio link on the CV.
Co-authored-by: Cursor <cursoragent@cursor.com>
</commit_message>
<xml_diff>
--- a/data/Karim-Saad-CV.docx
+++ b/data/Karim-Saad-CV.docx
@@ -28,9 +28,59 @@
           <w:rFonts w:ascii="Calibri" w:hAnsi="Calibri" w:eastAsia="Calibri"/>
           <w:b w:val="0"/>
           <w:i w:val="0"/>
-          <w:sz w:val="18"/>
+          <w:sz w:val="17"/>
         </w:rPr>
-        <w:t>karimsaad1552003@gmail.com   |   01145222298   |   github.com/karimsaad1552003-creator   |   Alexandria, Egypt</w:t>
+        <w:t xml:space="preserve">+20 114 522 2298 | karimsaad1552003@gmail.com | github.com/karimsaad1552003-creator | Portfolio: </w:t>
+      </w:r>
+      <w:hyperlink r:id="rId9">
+        <w:r>
+          <w:rPr>
+            <w:color w:val="595959"/>
+            <w:u w:val="single"/>
+            <w:sz w:val="17"/>
+            <w:rFonts w:ascii="Calibri" w:hAnsi="Calibri"/>
+          </w:rPr>
+          <w:t>karim-saad-portofolio.vercel.app</w:t>
+        </w:r>
+      </w:hyperlink>
+      <w:r>
+        <w:rPr>
+          <w:rFonts w:ascii="Calibri" w:hAnsi="Calibri" w:eastAsia="Calibri"/>
+          <w:b w:val="0"/>
+          <w:i w:val="0"/>
+          <w:sz w:val="17"/>
+        </w:rPr>
+        <w:t xml:space="preserve"> | Egypt</w:t>
+      </w:r>
+    </w:p>
+    <w:p>
+      <w:pPr>
+        <w:spacing w:before="0" w:after="0" w:line="240" w:lineRule="auto"/>
+        <w:jc w:val="center"/>
+      </w:pPr>
+      <w:r>
+        <w:rPr>
+          <w:rFonts w:ascii="Calibri" w:hAnsi="Calibri" w:eastAsia="Calibri"/>
+          <w:b w:val="0"/>
+          <w:i w:val="0"/>
+          <w:sz w:val="22"/>
+        </w:rPr>
+        <w:t>Full Stack Developer</w:t>
+      </w:r>
+    </w:p>
+    <w:p>
+      <w:pPr>
+        <w:spacing w:before="0" w:after="0" w:line="240" w:lineRule="auto"/>
+        <w:jc w:val="center"/>
+      </w:pPr>
+      <w:r>
+        <w:rPr>
+          <w:rFonts w:ascii="Calibri" w:hAnsi="Calibri" w:eastAsia="Calibri"/>
+          <w:b w:val="0"/>
+          <w:i w:val="0"/>
+          <w:sz w:val="22"/>
+        </w:rPr>
+        <w:t>Data Analyst</w:t>
       </w:r>
     </w:p>
     <w:p>
@@ -48,36 +98,7 @@
           <w:color w:val="1F3C24"/>
           <w:sz w:val="22"/>
         </w:rPr>
-        <w:t>EDUCATION</w:t>
-      </w:r>
-    </w:p>
-    <w:p>
-      <w:pPr>
-        <w:tabs>
-          <w:tab w:pos="10080" w:val="right"/>
-        </w:tabs>
-        <w:spacing w:before="80" w:after="0" w:line="252" w:lineRule="auto"/>
-      </w:pPr>
-      <w:r>
-        <w:rPr>
-          <w:rFonts w:ascii="Calibri" w:hAnsi="Calibri" w:eastAsia="Calibri"/>
-          <w:b/>
-          <w:i w:val="0"/>
-          <w:sz w:val="20"/>
-        </w:rPr>
-        <w:t>Arab Academy for Science, Technology &amp; Maritime Transport</w:t>
-      </w:r>
-      <w:r>
-        <w:tab/>
-      </w:r>
-      <w:r>
-        <w:rPr>
-          <w:rFonts w:ascii="Calibri" w:hAnsi="Calibri" w:eastAsia="Calibri"/>
-          <w:b w:val="0"/>
-          <w:i/>
-          <w:sz w:val="20"/>
-        </w:rPr>
-        <w:t>Egypt  |  2022 - 2026</w:t>
+        <w:t>PROFESSIONAL SUMMARY</w:t>
       </w:r>
     </w:p>
     <w:p>
@@ -91,36 +112,7 @@
           <w:i w:val="0"/>
           <w:sz w:val="20"/>
         </w:rPr>
-        <w:t>B.Sc. in Computer Science - Data Analysis &amp; Artificial Intelligence focus</w:t>
-      </w:r>
-    </w:p>
-    <w:p>
-      <w:pPr>
-        <w:tabs>
-          <w:tab w:pos="10080" w:val="right"/>
-        </w:tabs>
-        <w:spacing w:before="80" w:after="0" w:line="252" w:lineRule="auto"/>
-      </w:pPr>
-      <w:r>
-        <w:rPr>
-          <w:rFonts w:ascii="Calibri" w:hAnsi="Calibri" w:eastAsia="Calibri"/>
-          <w:b/>
-          <w:i w:val="0"/>
-          <w:sz w:val="20"/>
-        </w:rPr>
-        <w:t>College Saint-Marc</w:t>
-      </w:r>
-      <w:r>
-        <w:tab/>
-      </w:r>
-      <w:r>
-        <w:rPr>
-          <w:rFonts w:ascii="Calibri" w:hAnsi="Calibri" w:eastAsia="Calibri"/>
-          <w:b w:val="0"/>
-          <w:i/>
-          <w:sz w:val="20"/>
-        </w:rPr>
-        <w:t>Alexandria, Egypt</w:t>
+        <w:t>Information Systems graduate seeking full-stack developer and data analyst roles. Full-stack work includes co-founding Ascendra, where we build school systems and gate systems, and Vertex Reviews, where I delivered 20+ websites plus logos, flyers, and printable menus for business identity. Data analysis work includes Power BI dashboards, machine learning workflows, and a machine learning internship at Telecom Egypt. A year and a half in real estate sales at ElitePlus strengthened client communication and negotiation.</w:t>
       </w:r>
     </w:p>
     <w:p>
@@ -138,199 +130,7 @@
           <w:color w:val="1F3C24"/>
           <w:sz w:val="22"/>
         </w:rPr>
-        <w:t>SKILLS</w:t>
-      </w:r>
-    </w:p>
-    <w:p>
-      <w:pPr>
-        <w:spacing w:before="20" w:after="20" w:line="252" w:lineRule="auto"/>
-      </w:pPr>
-      <w:r>
-        <w:rPr>
-          <w:rFonts w:ascii="Calibri" w:hAnsi="Calibri" w:eastAsia="Calibri"/>
-          <w:b/>
-          <w:i w:val="0"/>
-          <w:sz w:val="20"/>
-        </w:rPr>
-        <w:t xml:space="preserve">Programming Languages: </w:t>
-      </w:r>
-      <w:r>
-        <w:rPr>
-          <w:rFonts w:ascii="Calibri" w:hAnsi="Calibri" w:eastAsia="Calibri"/>
-          <w:b w:val="0"/>
-          <w:i w:val="0"/>
-          <w:sz w:val="20"/>
-        </w:rPr>
-        <w:t>Python, Java, C, SQL</w:t>
-      </w:r>
-    </w:p>
-    <w:p>
-      <w:pPr>
-        <w:spacing w:before="20" w:after="20" w:line="252" w:lineRule="auto"/>
-      </w:pPr>
-      <w:r>
-        <w:rPr>
-          <w:rFonts w:ascii="Calibri" w:hAnsi="Calibri" w:eastAsia="Calibri"/>
-          <w:b/>
-          <w:i w:val="0"/>
-          <w:sz w:val="20"/>
-        </w:rPr>
-        <w:t xml:space="preserve">Languages: </w:t>
-      </w:r>
-      <w:r>
-        <w:rPr>
-          <w:rFonts w:ascii="Calibri" w:hAnsi="Calibri" w:eastAsia="Calibri"/>
-          <w:b w:val="0"/>
-          <w:i w:val="0"/>
-          <w:sz w:val="20"/>
-        </w:rPr>
-        <w:t>Arabic: Native    English: Fluent    French: DELF B1, Fluent</w:t>
-      </w:r>
-    </w:p>
-    <w:p>
-      <w:pPr>
-        <w:spacing w:before="20" w:after="20" w:line="252" w:lineRule="auto"/>
-      </w:pPr>
-      <w:r>
-        <w:rPr>
-          <w:rFonts w:ascii="Calibri" w:hAnsi="Calibri" w:eastAsia="Calibri"/>
-          <w:b/>
-          <w:i w:val="0"/>
-          <w:sz w:val="20"/>
-        </w:rPr>
-        <w:t xml:space="preserve">Frameworks &amp; Tools: </w:t>
-      </w:r>
-      <w:r>
-        <w:rPr>
-          <w:rFonts w:ascii="Calibri" w:hAnsi="Calibri" w:eastAsia="Calibri"/>
-          <w:b w:val="0"/>
-          <w:i w:val="0"/>
-          <w:sz w:val="20"/>
-        </w:rPr>
-        <w:t>Pandas, NumPy, Matplotlib, Seaborn, Scikit-learn, TensorFlow, PyTorch, Power BI, Tableau, Excel, Microsoft Project, Git &amp; GitHub</w:t>
-      </w:r>
-    </w:p>
-    <w:p>
-      <w:pPr>
-        <w:spacing w:before="20" w:after="20" w:line="252" w:lineRule="auto"/>
-      </w:pPr>
-      <w:r>
-        <w:rPr>
-          <w:rFonts w:ascii="Calibri" w:hAnsi="Calibri" w:eastAsia="Calibri"/>
-          <w:b/>
-          <w:i w:val="0"/>
-          <w:sz w:val="20"/>
-        </w:rPr>
-        <w:t xml:space="preserve">Domains: </w:t>
-      </w:r>
-      <w:r>
-        <w:rPr>
-          <w:rFonts w:ascii="Calibri" w:hAnsi="Calibri" w:eastAsia="Calibri"/>
-          <w:b w:val="0"/>
-          <w:i w:val="0"/>
-          <w:sz w:val="20"/>
-        </w:rPr>
-        <w:t>Full-Stack Development, Data Analysis, Machine Learning, Deep Learning, Requirements Analysis, Business Intelligence</w:t>
-      </w:r>
-    </w:p>
-    <w:p>
-      <w:pPr>
-        <w:spacing w:before="20" w:after="20" w:line="252" w:lineRule="auto"/>
-      </w:pPr>
-      <w:r>
-        <w:rPr>
-          <w:rFonts w:ascii="Calibri" w:hAnsi="Calibri" w:eastAsia="Calibri"/>
-          <w:b/>
-          <w:i w:val="0"/>
-          <w:sz w:val="20"/>
-        </w:rPr>
-        <w:t xml:space="preserve">Professional Skills: </w:t>
-      </w:r>
-      <w:r>
-        <w:rPr>
-          <w:rFonts w:ascii="Calibri" w:hAnsi="Calibri" w:eastAsia="Calibri"/>
-          <w:b w:val="0"/>
-          <w:i w:val="0"/>
-          <w:sz w:val="20"/>
-        </w:rPr>
-        <w:t>Client communication, Sales &amp; negotiation, Relationship building, Stakeholder collaboration</w:t>
-      </w:r>
-    </w:p>
-    <w:p>
-      <w:pPr>
-        <w:spacing w:before="160" w:after="80" w:line="240" w:lineRule="auto"/>
-        <w:pBdr>
-          <w:bottom w:val="single" w:sz="12" w:space="1" w:color="000000"/>
-        </w:pBdr>
-      </w:pPr>
-      <w:r>
-        <w:rPr>
-          <w:rFonts w:ascii="Calibri" w:hAnsi="Calibri" w:eastAsia="Calibri"/>
-          <w:b/>
-          <w:i w:val="0"/>
-          <w:color w:val="1F3C24"/>
-          <w:sz w:val="22"/>
-        </w:rPr>
-        <w:t>WORK EXPERIENCE &amp; CERTIFICATES</w:t>
-      </w:r>
-    </w:p>
-    <w:p>
-      <w:pPr>
-        <w:tabs>
-          <w:tab w:pos="10080" w:val="right"/>
-        </w:tabs>
-        <w:spacing w:before="80" w:after="0" w:line="252" w:lineRule="auto"/>
-      </w:pPr>
-      <w:r>
-        <w:rPr>
-          <w:rFonts w:ascii="Calibri" w:hAnsi="Calibri" w:eastAsia="Calibri"/>
-          <w:b/>
-          <w:i w:val="0"/>
-          <w:sz w:val="20"/>
-        </w:rPr>
-        <w:t>Co-founder - Ascendra</w:t>
-      </w:r>
-      <w:r>
-        <w:tab/>
-      </w:r>
-      <w:r>
-        <w:rPr>
-          <w:rFonts w:ascii="Calibri" w:hAnsi="Calibri" w:eastAsia="Calibri"/>
-          <w:b w:val="0"/>
-          <w:i/>
-          <w:sz w:val="20"/>
-        </w:rPr>
-        <w:t>Alexandria, Egypt  |  Present</w:t>
-      </w:r>
-    </w:p>
-    <w:p>
-      <w:pPr>
-        <w:pStyle w:val="ListBullet"/>
-        <w:spacing w:before="0" w:after="20" w:line="252" w:lineRule="auto"/>
-      </w:pPr>
-      <w:r>
-        <w:rPr>
-          <w:rFonts w:ascii="Calibri" w:hAnsi="Calibri" w:eastAsia="Calibri"/>
-          <w:b w:val="0"/>
-          <w:i w:val="0"/>
-          <w:sz w:val="20"/>
-        </w:rPr>
-        <w:t>Co-founded a technology studio building custom software, conversion-focused websites, and offline-first IoT systems for clients in Egypt and the United States.</w:t>
-      </w:r>
-    </w:p>
-    <w:p>
-      <w:pPr>
-        <w:pStyle w:val="ListBullet"/>
-        <w:spacing w:before="0" w:after="20" w:line="252" w:lineRule="auto"/>
-      </w:pPr>
-      <w:r>
-        <w:rPr>
-          <w:rFonts w:ascii="Calibri" w:hAnsi="Calibri" w:eastAsia="Calibri"/>
-          <w:b w:val="0"/>
-          <w:i w:val="0"/>
-          <w:sz w:val="20"/>
-        </w:rPr>
-        <w:t>Contribute to full-stack product delivery and support Ascendra as authorized Egypt operations partner of Vertex Reviews (New Jersey, USA).</w:t>
+        <w:t>EXPERIENCE</w:t>
       </w:r>
     </w:p>
     <w:p>
@@ -374,7 +174,7 @@
           <w:i w:val="0"/>
           <w:sz w:val="20"/>
         </w:rPr>
-        <w:t>Build and maintain production web experiences for Vertex Reviews, a Google Business Profile and reputation management company serving US businesses.</w:t>
+        <w:t>Delivered 20+ websites and business rebranding through logos, flyers, and printable menus.</w:t>
       </w:r>
     </w:p>
     <w:p>
@@ -389,7 +189,66 @@
           <w:i w:val="0"/>
           <w:sz w:val="20"/>
         </w:rPr>
-        <w:t>Support service storytelling, package presentation, and client conversion flows across the Ascendra x Vertex partnership.</w:t>
+        <w:t>Live product: https://www.vertexreviews.com</w:t>
+      </w:r>
+    </w:p>
+    <w:p>
+      <w:pPr>
+        <w:tabs>
+          <w:tab w:pos="10080" w:val="right"/>
+        </w:tabs>
+        <w:spacing w:before="80" w:after="0" w:line="252" w:lineRule="auto"/>
+      </w:pPr>
+      <w:r>
+        <w:rPr>
+          <w:rFonts w:ascii="Calibri" w:hAnsi="Calibri" w:eastAsia="Calibri"/>
+          <w:b/>
+          <w:i w:val="0"/>
+          <w:sz w:val="20"/>
+        </w:rPr>
+        <w:t>Co-founder - Ascendra</w:t>
+      </w:r>
+      <w:r>
+        <w:tab/>
+      </w:r>
+      <w:r>
+        <w:rPr>
+          <w:rFonts w:ascii="Calibri" w:hAnsi="Calibri" w:eastAsia="Calibri"/>
+          <w:b w:val="0"/>
+          <w:i/>
+          <w:sz w:val="20"/>
+        </w:rPr>
+        <w:t>Egypt  |  Present</w:t>
+      </w:r>
+    </w:p>
+    <w:p>
+      <w:pPr>
+        <w:pStyle w:val="ListBullet"/>
+        <w:spacing w:before="0" w:after="20" w:line="252" w:lineRule="auto"/>
+      </w:pPr>
+      <w:r>
+        <w:rPr>
+          <w:rFonts w:ascii="Calibri" w:hAnsi="Calibri" w:eastAsia="Calibri"/>
+          <w:b w:val="0"/>
+          <w:i w:val="0"/>
+          <w:sz w:val="20"/>
+        </w:rPr>
+        <w:t>Co-founded the studio. We build school systems and gate systems.</w:t>
+      </w:r>
+    </w:p>
+    <w:p>
+      <w:pPr>
+        <w:pStyle w:val="ListBullet"/>
+        <w:spacing w:before="0" w:after="20" w:line="252" w:lineRule="auto"/>
+      </w:pPr>
+      <w:r>
+        <w:rPr>
+          <w:rFonts w:ascii="Calibri" w:hAnsi="Calibri" w:eastAsia="Calibri"/>
+          <w:b w:val="0"/>
+          <w:i w:val="0"/>
+          <w:sz w:val="20"/>
+        </w:rPr>
+        <w:t>Live product: https://ascendrasol.com/</w:t>
       </w:r>
     </w:p>
     <w:p>
@@ -433,7 +292,7 @@
           <w:i w:val="0"/>
           <w:sz w:val="20"/>
         </w:rPr>
-        <w:t>Spent one year in client-facing real estate sales, building strong communication, negotiation, and relationship-management skills.</w:t>
+        <w:t>Spent a year and a half in client-facing sales, building communication, negotiation, and relationship management.</w:t>
       </w:r>
     </w:p>
     <w:p>
@@ -477,7 +336,7 @@
           <w:i w:val="0"/>
           <w:sz w:val="20"/>
         </w:rPr>
-        <w:t>Worked on machine and deep learning development tasks, including data preparation and model-oriented problem solving in an enterprise environment.</w:t>
+        <w:t>Worked on machine and deep learning tasks, including data preparation and model development.</w:t>
       </w:r>
     </w:p>
     <w:p>
@@ -521,30 +380,7 @@
           <w:i w:val="0"/>
           <w:sz w:val="20"/>
         </w:rPr>
-        <w:t>Analyzed software requirements, clarified system expectations, and supported structured documentation for implementation-ready specifications.</w:t>
-      </w:r>
-    </w:p>
-    <w:p>
-      <w:pPr>
-        <w:spacing w:before="120" w:after="40" w:line="252" w:lineRule="auto"/>
-      </w:pPr>
-      <w:r>
-        <w:rPr>
-          <w:rFonts w:ascii="Calibri" w:hAnsi="Calibri" w:eastAsia="Calibri"/>
-          <w:b/>
-          <w:i w:val="0"/>
-          <w:sz w:val="20"/>
-        </w:rPr>
-        <w:t xml:space="preserve">Certificates: </w:t>
-      </w:r>
-      <w:r>
-        <w:rPr>
-          <w:rFonts w:ascii="Calibri" w:hAnsi="Calibri" w:eastAsia="Calibri"/>
-          <w:b w:val="0"/>
-          <w:i w:val="0"/>
-          <w:sz w:val="20"/>
-        </w:rPr>
-        <w:t>Cisco CyberOps Associate (CBROPS) - NTI (Excellent); CCNA - Cisco; Odoo Technical Bootcamp - Feb 2026</w:t>
+        <w:t>Analyzed software requirements and wrote specifications for implementation.</w:t>
       </w:r>
     </w:p>
     <w:p>
@@ -562,11 +398,42 @@
           <w:color w:val="1F3C24"/>
           <w:sz w:val="22"/>
         </w:rPr>
-        <w:t>PROJECTS</w:t>
+        <w:t>EDUCATION</w:t>
       </w:r>
     </w:p>
     <w:p>
       <w:pPr>
+        <w:spacing w:before="40" w:after="0" w:line="252" w:lineRule="auto"/>
+      </w:pPr>
+      <w:r>
+        <w:rPr>
+          <w:rFonts w:ascii="Calibri" w:hAnsi="Calibri" w:eastAsia="Calibri"/>
+          <w:b/>
+          <w:i w:val="0"/>
+          <w:sz w:val="20"/>
+        </w:rPr>
+        <w:t>Bachelor of Information Systems</w:t>
+      </w:r>
+    </w:p>
+    <w:p>
+      <w:pPr>
+        <w:spacing w:before="0" w:after="40" w:line="252" w:lineRule="auto"/>
+      </w:pPr>
+      <w:r>
+        <w:rPr>
+          <w:rFonts w:ascii="Calibri" w:hAnsi="Calibri" w:eastAsia="Calibri"/>
+          <w:b w:val="0"/>
+          <w:i w:val="0"/>
+          <w:sz w:val="20"/>
+        </w:rPr>
+        <w:t>College of Computing and Information Technology</w:t>
+      </w:r>
+    </w:p>
+    <w:p>
+      <w:pPr>
+        <w:tabs>
+          <w:tab w:pos="10080" w:val="right"/>
+        </w:tabs>
         <w:spacing w:before="80" w:after="0" w:line="252" w:lineRule="auto"/>
       </w:pPr>
       <w:r>
@@ -576,81 +443,37 @@
           <w:i w:val="0"/>
           <w:sz w:val="20"/>
         </w:rPr>
-        <w:t>Vertex Reviews Platform  |  Full-stack web</w:t>
+        <w:t>Arab Academy for Science, Technology &amp; Maritime Transport</w:t>
       </w:r>
       <w:r>
-        <w:t xml:space="preserve">  </w:t>
+        <w:tab/>
       </w:r>
-      <w:hyperlink r:id="rId9">
-        <w:r>
-          <w:rPr>
-            <w:rFonts w:ascii="Calibri" w:hAnsi="Calibri"/>
-            <w:color w:val="595959"/>
-            <w:i/>
-            <w:sz w:val="20"/>
-            <w:u w:val="single"/>
-          </w:rPr>
-          <w:t>-&gt; Here</w:t>
-        </w:r>
-      </w:hyperlink>
-    </w:p>
-    <w:p>
-      <w:pPr>
-        <w:pStyle w:val="ListBullet"/>
-        <w:spacing w:before="0" w:after="20" w:line="252" w:lineRule="auto"/>
-      </w:pPr>
       <w:r>
         <w:rPr>
           <w:rFonts w:ascii="Calibri" w:hAnsi="Calibri" w:eastAsia="Calibri"/>
           <w:b w:val="0"/>
-          <w:i w:val="0"/>
+          <w:i/>
           <w:sz w:val="20"/>
         </w:rPr>
-        <w:t>Production website and service platform for Google Business Profile optimization, review monitoring, growth strategy, and service packages for US businesses.</w:t>
+        <w:t>Egypt  |  2022 - 2026</w:t>
       </w:r>
     </w:p>
     <w:p>
       <w:pPr>
-        <w:spacing w:before="80" w:after="0" w:line="252" w:lineRule="auto"/>
+        <w:spacing w:before="160" w:after="80" w:line="240" w:lineRule="auto"/>
+        <w:pBdr>
+          <w:bottom w:val="single" w:sz="12" w:space="1" w:color="000000"/>
+        </w:pBdr>
       </w:pPr>
       <w:r>
         <w:rPr>
           <w:rFonts w:ascii="Calibri" w:hAnsi="Calibri" w:eastAsia="Calibri"/>
           <w:b/>
           <w:i w:val="0"/>
-          <w:sz w:val="20"/>
+          <w:color w:val="1F3C24"/>
+          <w:sz w:val="22"/>
         </w:rPr>
-        <w:t>Ascendra  |  React, Next.js, TypeScript, NestJS, PostgreSQL, Flutter, Python</w:t>
-      </w:r>
-      <w:r>
-        <w:t xml:space="preserve">  </w:t>
-      </w:r>
-      <w:hyperlink r:id="rId10">
-        <w:r>
-          <w:rPr>
-            <w:rFonts w:ascii="Calibri" w:hAnsi="Calibri"/>
-            <w:color w:val="595959"/>
-            <w:i/>
-            <w:sz w:val="20"/>
-            <w:u w:val="single"/>
-          </w:rPr>
-          <w:t>-&gt; Here</w:t>
-        </w:r>
-      </w:hyperlink>
-    </w:p>
-    <w:p>
-      <w:pPr>
-        <w:pStyle w:val="ListBullet"/>
-        <w:spacing w:before="0" w:after="20" w:line="252" w:lineRule="auto"/>
-      </w:pPr>
-      <w:r>
-        <w:rPr>
-          <w:rFonts w:ascii="Calibri" w:hAnsi="Calibri" w:eastAsia="Calibri"/>
-          <w:b w:val="0"/>
-          <w:i w:val="0"/>
-          <w:sz w:val="20"/>
-        </w:rPr>
-        <w:t>Co-founded technology studio shipping custom software, business websites, and offline-first IoT systems (including Sahel Gate and Full School System) for US and Egypt clients.</w:t>
+        <w:t>ACADEMIC PROJECTS</w:t>
       </w:r>
     </w:p>
     <w:p>
@@ -679,7 +502,7 @@
           <w:i w:val="0"/>
           <w:sz w:val="20"/>
         </w:rPr>
-        <w:t>Interactive Power BI dashboard analyzing 16,000+ video game sales records across regions to identify platform, genre, and market trends for forecasting and targeting.</w:t>
+        <w:t>Interactive dashboard on 16,000+ sales records across regions, platforms, and genres.</w:t>
       </w:r>
     </w:p>
     <w:p>
@@ -693,7 +516,7 @@
           <w:i w:val="0"/>
           <w:sz w:val="20"/>
         </w:rPr>
-        <w:t>Machine &amp; Deep Learning Workflows  |  Python, Pandas, Scikit-learn, TensorFlow, PyTorch</w:t>
+        <w:t>Machine and Deep Learning Workflows  |  Python, Pandas, Scikit-learn, TensorFlow, PyTorch</w:t>
       </w:r>
     </w:p>
     <w:p>
@@ -708,7 +531,7 @@
           <w:i w:val="0"/>
           <w:sz w:val="20"/>
         </w:rPr>
-        <w:t>End-to-end ML workflows covering data collection, cleaning, transformation, model development, and evaluation to support data-driven decisions.</w:t>
+        <w:t>End-to-end workflows: collection, cleaning, transformation, model development, and evaluation.</w:t>
       </w:r>
     </w:p>
     <w:p>
@@ -722,7 +545,7 @@
           <w:i w:val="0"/>
           <w:sz w:val="20"/>
         </w:rPr>
-        <w:t>Ticketing Management System Design  |  ERD, Data modeling</w:t>
+        <w:t>Ticketing Management System  |  ERD, data modeling</w:t>
       </w:r>
     </w:p>
     <w:p>
@@ -737,7 +560,7 @@
           <w:i w:val="0"/>
           <w:sz w:val="20"/>
         </w:rPr>
-        <w:t>Designed ERD, data dictionary, and technical specification covering tickets, users, departments, priorities, and status logs.</w:t>
+        <w:t>ERD, data dictionary, and technical specification for tickets, users, departments, priorities, and status logs.</w:t>
       </w:r>
     </w:p>
     <w:p>
@@ -751,7 +574,7 @@
           <w:i w:val="0"/>
           <w:sz w:val="20"/>
         </w:rPr>
-        <w:t>Pharmacy Management System Planning  |  Microsoft Project</w:t>
+        <w:t>Pharmacy Management System  |  Microsoft Project</w:t>
       </w:r>
     </w:p>
     <w:p>
@@ -766,7 +589,203 @@
           <w:i w:val="0"/>
           <w:sz w:val="20"/>
         </w:rPr>
-        <w:t>Defined project scope, tasks, timelines, resources, Gantt charts, and milestones for a Pharmacy Management System using Microsoft Project.</w:t>
+        <w:t>Scope, tasks, timelines, resources, Gantt chart, and milestones.</w:t>
+      </w:r>
+    </w:p>
+    <w:p>
+      <w:pPr>
+        <w:spacing w:before="160" w:after="80" w:line="240" w:lineRule="auto"/>
+        <w:pBdr>
+          <w:bottom w:val="single" w:sz="12" w:space="1" w:color="000000"/>
+        </w:pBdr>
+      </w:pPr>
+      <w:r>
+        <w:rPr>
+          <w:rFonts w:ascii="Calibri" w:hAnsi="Calibri" w:eastAsia="Calibri"/>
+          <w:b/>
+          <w:i w:val="0"/>
+          <w:color w:val="1F3C24"/>
+          <w:sz w:val="22"/>
+        </w:rPr>
+        <w:t>SKILLS</w:t>
+      </w:r>
+    </w:p>
+    <w:p>
+      <w:pPr>
+        <w:spacing w:before="20" w:after="20" w:line="252" w:lineRule="auto"/>
+      </w:pPr>
+      <w:r>
+        <w:rPr>
+          <w:rFonts w:ascii="Calibri" w:hAnsi="Calibri" w:eastAsia="Calibri"/>
+          <w:b/>
+          <w:i w:val="0"/>
+          <w:sz w:val="20"/>
+        </w:rPr>
+        <w:t xml:space="preserve">Programming languages: </w:t>
+      </w:r>
+      <w:r>
+        <w:rPr>
+          <w:rFonts w:ascii="Calibri" w:hAnsi="Calibri" w:eastAsia="Calibri"/>
+          <w:b w:val="0"/>
+          <w:i w:val="0"/>
+          <w:sz w:val="20"/>
+        </w:rPr>
+        <w:t>Python, Java, C, SQL</w:t>
+      </w:r>
+    </w:p>
+    <w:p>
+      <w:pPr>
+        <w:spacing w:before="20" w:after="20" w:line="252" w:lineRule="auto"/>
+      </w:pPr>
+      <w:r>
+        <w:rPr>
+          <w:rFonts w:ascii="Calibri" w:hAnsi="Calibri" w:eastAsia="Calibri"/>
+          <w:b/>
+          <w:i w:val="0"/>
+          <w:sz w:val="20"/>
+        </w:rPr>
+        <w:t xml:space="preserve">Data and AI: </w:t>
+      </w:r>
+      <w:r>
+        <w:rPr>
+          <w:rFonts w:ascii="Calibri" w:hAnsi="Calibri" w:eastAsia="Calibri"/>
+          <w:b w:val="0"/>
+          <w:i w:val="0"/>
+          <w:sz w:val="20"/>
+        </w:rPr>
+        <w:t>Pandas, NumPy, Matplotlib, Seaborn, Scikit-learn, TensorFlow, PyTorch, Power BI, Tableau, Excel</w:t>
+      </w:r>
+    </w:p>
+    <w:p>
+      <w:pPr>
+        <w:spacing w:before="20" w:after="20" w:line="252" w:lineRule="auto"/>
+      </w:pPr>
+      <w:r>
+        <w:rPr>
+          <w:rFonts w:ascii="Calibri" w:hAnsi="Calibri" w:eastAsia="Calibri"/>
+          <w:b/>
+          <w:i w:val="0"/>
+          <w:sz w:val="20"/>
+        </w:rPr>
+        <w:t xml:space="preserve">Analysis: </w:t>
+      </w:r>
+      <w:r>
+        <w:rPr>
+          <w:rFonts w:ascii="Calibri" w:hAnsi="Calibri" w:eastAsia="Calibri"/>
+          <w:b w:val="0"/>
+          <w:i w:val="0"/>
+          <w:sz w:val="20"/>
+        </w:rPr>
+        <w:t>Requirements analysis, ERD, technical specifications, Microsoft Project, Git</w:t>
+      </w:r>
+    </w:p>
+    <w:p>
+      <w:pPr>
+        <w:spacing w:before="20" w:after="20" w:line="252" w:lineRule="auto"/>
+      </w:pPr>
+      <w:r>
+        <w:rPr>
+          <w:rFonts w:ascii="Calibri" w:hAnsi="Calibri" w:eastAsia="Calibri"/>
+          <w:b/>
+          <w:i w:val="0"/>
+          <w:sz w:val="20"/>
+        </w:rPr>
+        <w:t xml:space="preserve">Professional: </w:t>
+      </w:r>
+      <w:r>
+        <w:rPr>
+          <w:rFonts w:ascii="Calibri" w:hAnsi="Calibri" w:eastAsia="Calibri"/>
+          <w:b w:val="0"/>
+          <w:i w:val="0"/>
+          <w:sz w:val="20"/>
+        </w:rPr>
+        <w:t>Client communication, sales and negotiation, relationship building</w:t>
+      </w:r>
+    </w:p>
+    <w:p>
+      <w:pPr>
+        <w:spacing w:before="20" w:after="20" w:line="252" w:lineRule="auto"/>
+      </w:pPr>
+      <w:r>
+        <w:rPr>
+          <w:rFonts w:ascii="Calibri" w:hAnsi="Calibri" w:eastAsia="Calibri"/>
+          <w:b/>
+          <w:i w:val="0"/>
+          <w:sz w:val="20"/>
+        </w:rPr>
+        <w:t xml:space="preserve">Spoken languages: </w:t>
+      </w:r>
+      <w:r>
+        <w:rPr>
+          <w:rFonts w:ascii="Calibri" w:hAnsi="Calibri" w:eastAsia="Calibri"/>
+          <w:b w:val="0"/>
+          <w:i w:val="0"/>
+          <w:sz w:val="20"/>
+        </w:rPr>
+        <w:t>Arabic (Native), English (Fluent), French (DELF B1, Fluent)</w:t>
+      </w:r>
+    </w:p>
+    <w:p>
+      <w:pPr>
+        <w:spacing w:before="160" w:after="80" w:line="240" w:lineRule="auto"/>
+        <w:pBdr>
+          <w:bottom w:val="single" w:sz="12" w:space="1" w:color="000000"/>
+        </w:pBdr>
+      </w:pPr>
+      <w:r>
+        <w:rPr>
+          <w:rFonts w:ascii="Calibri" w:hAnsi="Calibri" w:eastAsia="Calibri"/>
+          <w:b/>
+          <w:i w:val="0"/>
+          <w:color w:val="1F3C24"/>
+          <w:sz w:val="22"/>
+        </w:rPr>
+        <w:t>CERTIFICATIONS</w:t>
+      </w:r>
+    </w:p>
+    <w:p>
+      <w:pPr>
+        <w:pStyle w:val="ListBullet"/>
+        <w:spacing w:before="0" w:after="20" w:line="252" w:lineRule="auto"/>
+      </w:pPr>
+      <w:r>
+        <w:rPr>
+          <w:rFonts w:ascii="Calibri" w:hAnsi="Calibri" w:eastAsia="Calibri"/>
+          <w:b w:val="0"/>
+          <w:i w:val="0"/>
+          <w:sz w:val="20"/>
+        </w:rPr>
+        <w:t>Cisco CyberOps Associate (CBROPS), NTI - Excellent</w:t>
+      </w:r>
+    </w:p>
+    <w:p>
+      <w:pPr>
+        <w:pStyle w:val="ListBullet"/>
+        <w:spacing w:before="0" w:after="20" w:line="252" w:lineRule="auto"/>
+      </w:pPr>
+      <w:r>
+        <w:rPr>
+          <w:rFonts w:ascii="Calibri" w:hAnsi="Calibri" w:eastAsia="Calibri"/>
+          <w:b w:val="0"/>
+          <w:i w:val="0"/>
+          <w:sz w:val="20"/>
+        </w:rPr>
+        <w:t>CCNA, Cisco</w:t>
+      </w:r>
+    </w:p>
+    <w:p>
+      <w:pPr>
+        <w:pStyle w:val="ListBullet"/>
+        <w:spacing w:before="0" w:after="20" w:line="252" w:lineRule="auto"/>
+      </w:pPr>
+      <w:r>
+        <w:rPr>
+          <w:rFonts w:ascii="Calibri" w:hAnsi="Calibri" w:eastAsia="Calibri"/>
+          <w:b w:val="0"/>
+          <w:i w:val="0"/>
+          <w:sz w:val="20"/>
+        </w:rPr>
+        <w:t>Odoo Technical Bootcamp - February 2026, 8-hour course</w:t>
       </w:r>
     </w:p>
     <w:sectPr>

</xml_diff>

<commit_message>
Update CV and portfolio with new experiences and contact details. Enhanced CV formatting for better readability, added new project "VulnGPT," and included certificate links in the experience section. Updated roles and responsibilities for Ascendra and Vertex Reviews, and revised education and skills sections for accuracy.
</commit_message>
<xml_diff>
--- a/data/Karim-Saad-CV.docx
+++ b/data/Karim-Saad-CV.docx
@@ -28,19 +28,20 @@
           <w:rFonts w:ascii="Calibri" w:hAnsi="Calibri" w:eastAsia="Calibri"/>
           <w:b w:val="0"/>
           <w:i w:val="0"/>
-          <w:sz w:val="17"/>
+          <w:sz w:val="18"/>
         </w:rPr>
-        <w:t xml:space="preserve">+20 114 522 2298 | karimsaad1552003@gmail.com | github.com/karimsaad1552003-creator | Portfolio: </w:t>
+        <w:t>+20 114 522 2298 | karimsaad1552003@gmail.com | Egypt</w:t>
+        <w:br/>
       </w:r>
       <w:hyperlink r:id="rId9">
         <w:r>
           <w:rPr>
             <w:color w:val="595959"/>
             <w:u w:val="single"/>
-            <w:sz w:val="17"/>
+            <w:sz w:val="18"/>
             <w:rFonts w:ascii="Calibri" w:hAnsi="Calibri"/>
           </w:rPr>
-          <w:t>karim-saad-portofolio.vercel.app</w:t>
+          <w:t>linkedin.com/in/karimmsaad</w:t>
         </w:r>
       </w:hyperlink>
       <w:r>
@@ -48,10 +49,41 @@
           <w:rFonts w:ascii="Calibri" w:hAnsi="Calibri" w:eastAsia="Calibri"/>
           <w:b w:val="0"/>
           <w:i w:val="0"/>
-          <w:sz w:val="17"/>
+          <w:sz w:val="18"/>
         </w:rPr>
-        <w:t xml:space="preserve"> | Egypt</w:t>
+        <w:t xml:space="preserve"> | </w:t>
       </w:r>
+      <w:hyperlink r:id="rId10">
+        <w:r>
+          <w:rPr>
+            <w:color w:val="595959"/>
+            <w:u w:val="single"/>
+            <w:sz w:val="18"/>
+            <w:rFonts w:ascii="Calibri" w:hAnsi="Calibri"/>
+          </w:rPr>
+          <w:t>github.com/karimsaad1552003-creator</w:t>
+        </w:r>
+      </w:hyperlink>
+      <w:r>
+        <w:rPr>
+          <w:rFonts w:ascii="Calibri" w:hAnsi="Calibri" w:eastAsia="Calibri"/>
+          <w:b w:val="0"/>
+          <w:i w:val="0"/>
+          <w:sz w:val="18"/>
+        </w:rPr>
+        <w:t xml:space="preserve"> | Portfolio: </w:t>
+      </w:r>
+      <w:hyperlink r:id="rId11">
+        <w:r>
+          <w:rPr>
+            <w:color w:val="595959"/>
+            <w:u w:val="single"/>
+            <w:sz w:val="18"/>
+            <w:rFonts w:ascii="Calibri" w:hAnsi="Calibri"/>
+          </w:rPr>
+          <w:t>karim-saad-portofolio.vercel.app</w:t>
+        </w:r>
+      </w:hyperlink>
     </w:p>
     <w:p>
       <w:pPr>
@@ -112,7 +144,7 @@
           <w:i w:val="0"/>
           <w:sz w:val="20"/>
         </w:rPr>
-        <w:t>Information Systems graduate seeking full-stack developer and data analyst roles. Full-stack work includes co-founding Ascendra, where we build school systems and gate systems, and Vertex Reviews, where I delivered 20+ websites plus logos, flyers, and printable menus for business identity. Data analysis work includes Power BI dashboards, machine learning workflows, and a machine learning internship at Telecom Egypt. A year and a half in real estate sales at ElitePlus strengthened client communication and negotiation.</w:t>
+        <w:t>Information Systems graduate seeking full-stack developer and data analyst roles. Full-stack work includes Ascendra, where we build school systems and gate systems, and Vertex Reviews, where I delivered 20+ websites plus logos, flyers, and printable menus for business identity. Data analysis work includes Power BI dashboards, machine learning workflows, and a machine learning internship at Telecom Egypt. Real estate sales at ElitePlus strengthened client communication and negotiation.</w:t>
       </w:r>
     </w:p>
     <w:p>
@@ -147,6 +179,65 @@
           <w:i w:val="0"/>
           <w:sz w:val="20"/>
         </w:rPr>
+        <w:t>Full Stack Developer - Ascendra</w:t>
+      </w:r>
+      <w:r>
+        <w:tab/>
+      </w:r>
+      <w:r>
+        <w:rPr>
+          <w:rFonts w:ascii="Calibri" w:hAnsi="Calibri" w:eastAsia="Calibri"/>
+          <w:b w:val="0"/>
+          <w:i/>
+          <w:sz w:val="20"/>
+        </w:rPr>
+        <w:t>Egypt  |  Apr 2026 - Present</w:t>
+      </w:r>
+    </w:p>
+    <w:p>
+      <w:pPr>
+        <w:pStyle w:val="ListBullet"/>
+        <w:spacing w:before="0" w:after="20" w:line="252" w:lineRule="auto"/>
+      </w:pPr>
+      <w:r>
+        <w:rPr>
+          <w:rFonts w:ascii="Calibri" w:hAnsi="Calibri" w:eastAsia="Calibri"/>
+          <w:b w:val="0"/>
+          <w:i w:val="0"/>
+          <w:sz w:val="20"/>
+        </w:rPr>
+        <w:t>We build school systems and gate systems.</w:t>
+      </w:r>
+    </w:p>
+    <w:p>
+      <w:pPr>
+        <w:pStyle w:val="ListBullet"/>
+        <w:spacing w:before="0" w:after="20" w:line="252" w:lineRule="auto"/>
+      </w:pPr>
+      <w:r>
+        <w:rPr>
+          <w:rFonts w:ascii="Calibri" w:hAnsi="Calibri" w:eastAsia="Calibri"/>
+          <w:b w:val="0"/>
+          <w:i w:val="0"/>
+          <w:sz w:val="20"/>
+        </w:rPr>
+        <w:t>Live product: https://ascendrasol.com/</w:t>
+      </w:r>
+    </w:p>
+    <w:p>
+      <w:pPr>
+        <w:tabs>
+          <w:tab w:pos="10080" w:val="right"/>
+        </w:tabs>
+        <w:spacing w:before="80" w:after="0" w:line="252" w:lineRule="auto"/>
+      </w:pPr>
+      <w:r>
+        <w:rPr>
+          <w:rFonts w:ascii="Calibri" w:hAnsi="Calibri" w:eastAsia="Calibri"/>
+          <w:b/>
+          <w:i w:val="0"/>
+          <w:sz w:val="20"/>
+        </w:rPr>
         <w:t>Full Stack Developer - Vertex Reviews</w:t>
       </w:r>
       <w:r>
@@ -159,7 +250,22 @@
           <w:i/>
           <w:sz w:val="20"/>
         </w:rPr>
-        <w:t>New Jersey, USA (remote)  |  Present</w:t>
+        <w:t>New Jersey, USA (remote)  |  Apr 2026 - Present</w:t>
+      </w:r>
+    </w:p>
+    <w:p>
+      <w:pPr>
+        <w:pStyle w:val="ListBullet"/>
+        <w:spacing w:before="0" w:after="20" w:line="252" w:lineRule="auto"/>
+      </w:pPr>
+      <w:r>
+        <w:rPr>
+          <w:rFonts w:ascii="Calibri" w:hAnsi="Calibri" w:eastAsia="Calibri"/>
+          <w:b w:val="0"/>
+          <w:i w:val="0"/>
+          <w:sz w:val="20"/>
+        </w:rPr>
+        <w:t>Work with Vertex through its collaboration with Ascendra, which runs Vertex's back-end services.</w:t>
       </w:r>
     </w:p>
     <w:p>
@@ -206,7 +312,7 @@
           <w:i w:val="0"/>
           <w:sz w:val="20"/>
         </w:rPr>
-        <w:t>Co-founder - Ascendra</w:t>
+        <w:t>Real Estate Agent (Sales) - ElitePlus</w:t>
       </w:r>
       <w:r>
         <w:tab/>
@@ -218,7 +324,7 @@
           <w:i/>
           <w:sz w:val="20"/>
         </w:rPr>
-        <w:t>Egypt  |  Present</w:t>
+        <w:t>Egypt  |  Aug 2025 - Oct 2026</w:t>
       </w:r>
     </w:p>
     <w:p>
@@ -233,66 +339,7 @@
           <w:i w:val="0"/>
           <w:sz w:val="20"/>
         </w:rPr>
-        <w:t>Co-founded the studio. We build school systems and gate systems.</w:t>
-      </w:r>
-    </w:p>
-    <w:p>
-      <w:pPr>
-        <w:pStyle w:val="ListBullet"/>
-        <w:spacing w:before="0" w:after="20" w:line="252" w:lineRule="auto"/>
-      </w:pPr>
-      <w:r>
-        <w:rPr>
-          <w:rFonts w:ascii="Calibri" w:hAnsi="Calibri" w:eastAsia="Calibri"/>
-          <w:b w:val="0"/>
-          <w:i w:val="0"/>
-          <w:sz w:val="20"/>
-        </w:rPr>
-        <w:t>Live product: https://ascendrasol.com/</w:t>
-      </w:r>
-    </w:p>
-    <w:p>
-      <w:pPr>
-        <w:tabs>
-          <w:tab w:pos="10080" w:val="right"/>
-        </w:tabs>
-        <w:spacing w:before="80" w:after="0" w:line="252" w:lineRule="auto"/>
-      </w:pPr>
-      <w:r>
-        <w:rPr>
-          <w:rFonts w:ascii="Calibri" w:hAnsi="Calibri" w:eastAsia="Calibri"/>
-          <w:b/>
-          <w:i w:val="0"/>
-          <w:sz w:val="20"/>
-        </w:rPr>
-        <w:t>Real Estate Agent (Sales) - ElitePlus</w:t>
-      </w:r>
-      <w:r>
-        <w:tab/>
-      </w:r>
-      <w:r>
-        <w:rPr>
-          <w:rFonts w:ascii="Calibri" w:hAnsi="Calibri" w:eastAsia="Calibri"/>
-          <w:b w:val="0"/>
-          <w:i/>
-          <w:sz w:val="20"/>
-        </w:rPr>
-        <w:t>Egypt  |  2025 - 2026</w:t>
-      </w:r>
-    </w:p>
-    <w:p>
-      <w:pPr>
-        <w:pStyle w:val="ListBullet"/>
-        <w:spacing w:before="0" w:after="20" w:line="252" w:lineRule="auto"/>
-      </w:pPr>
-      <w:r>
-        <w:rPr>
-          <w:rFonts w:ascii="Calibri" w:hAnsi="Calibri" w:eastAsia="Calibri"/>
-          <w:b w:val="0"/>
-          <w:i w:val="0"/>
-          <w:sz w:val="20"/>
-        </w:rPr>
-        <w:t>Spent a year and a half in client-facing sales, building communication, negotiation, and relationship management.</w:t>
+        <w:t>Worked in client-facing sales, building communication, negotiation, and relationship management.</w:t>
       </w:r>
     </w:p>
     <w:p>
@@ -321,7 +368,7 @@
           <w:i/>
           <w:sz w:val="20"/>
         </w:rPr>
-        <w:t>Egypt  |  Internship</w:t>
+        <w:t>Egypt  |  Jan 2025 - Feb 2025</w:t>
       </w:r>
     </w:p>
     <w:p>
@@ -365,7 +412,7 @@
           <w:i/>
           <w:sz w:val="20"/>
         </w:rPr>
-        <w:t>Egypt  |  Internship</w:t>
+        <w:t>Egypt  |  Jul 2024 - Aug 2024</w:t>
       </w:r>
     </w:p>
     <w:p>
@@ -474,6 +521,50 @@
           <w:sz w:val="22"/>
         </w:rPr>
         <w:t>ACADEMIC PROJECTS</w:t>
+      </w:r>
+    </w:p>
+    <w:p>
+      <w:pPr>
+        <w:spacing w:before="80" w:after="0" w:line="252" w:lineRule="auto"/>
+      </w:pPr>
+      <w:r>
+        <w:rPr>
+          <w:rFonts w:ascii="Calibri" w:hAnsi="Calibri" w:eastAsia="Calibri"/>
+          <w:b/>
+          <w:i w:val="0"/>
+          <w:sz w:val="20"/>
+        </w:rPr>
+        <w:t>VulnGPT - AI-Assisted Web Vulnerability Analysis Engine</w:t>
+      </w:r>
+    </w:p>
+    <w:p>
+      <w:pPr>
+        <w:pStyle w:val="ListBullet"/>
+        <w:spacing w:before="0" w:after="20" w:line="252" w:lineRule="auto"/>
+      </w:pPr>
+      <w:r>
+        <w:rPr>
+          <w:rFonts w:ascii="Calibri" w:hAnsi="Calibri" w:eastAsia="Calibri"/>
+          <w:b w:val="0"/>
+          <w:i w:val="0"/>
+          <w:sz w:val="20"/>
+        </w:rPr>
+        <w:t>AI-powered web security testing platform using HTTP/HTTPS traffic analysis, controlled security testing, and evidence-based reporting, with AI-assisted vulnerability analysis, risk prioritization, false-positive verification, and remediation recommendations.</w:t>
+      </w:r>
+    </w:p>
+    <w:p>
+      <w:pPr>
+        <w:pStyle w:val="ListBullet"/>
+        <w:spacing w:before="0" w:after="20" w:line="252" w:lineRule="auto"/>
+      </w:pPr>
+      <w:r>
+        <w:rPr>
+          <w:rFonts w:ascii="Calibri" w:hAnsi="Calibri" w:eastAsia="Calibri"/>
+          <w:b w:val="0"/>
+          <w:i w:val="0"/>
+          <w:sz w:val="20"/>
+        </w:rPr>
+        <w:t>Nominated for discussion before the College Council for its technical value and potential impact.</w:t>
       </w:r>
     </w:p>
     <w:p>
@@ -756,21 +847,6 @@
           <w:sz w:val="20"/>
         </w:rPr>
         <w:t>Cisco CyberOps Associate (CBROPS), NTI - Excellent</w:t>
-      </w:r>
-    </w:p>
-    <w:p>
-      <w:pPr>
-        <w:pStyle w:val="ListBullet"/>
-        <w:spacing w:before="0" w:after="20" w:line="252" w:lineRule="auto"/>
-      </w:pPr>
-      <w:r>
-        <w:rPr>
-          <w:rFonts w:ascii="Calibri" w:hAnsi="Calibri" w:eastAsia="Calibri"/>
-          <w:b w:val="0"/>
-          <w:i w:val="0"/>
-          <w:sz w:val="20"/>
-        </w:rPr>
-        <w:t>CCNA, Cisco</w:t>
       </w:r>
     </w:p>
     <w:p>

</xml_diff>